<commit_message>
Reqs con prompt y conteo de insumos
</commit_message>
<xml_diff>
--- a/resources/pep_templates/pep_template.docx
+++ b/resources/pep_templates/pep_template.docx
@@ -85,7 +85,7 @@
               </wp:anchor>
             </w:drawing>
           </mc:Choice>
-          <mc:Fallback xmlns:sl="http://schemas.openxmlformats.org/schemaLibrary/2006/main" xmlns:a="http://schemas.openxmlformats.org/drawingml/2006/main" xmlns:pic="http://schemas.openxmlformats.org/drawingml/2006/picture" xmlns:c="http://schemas.openxmlformats.org/drawingml/2006/chart" xmlns:lc="http://schemas.openxmlformats.org/drawingml/2006/lockedCanvas" xmlns:dgm="http://schemas.openxmlformats.org/drawingml/2006/diagram" xmlns="http://schemas.microsoft.com/office/tasks/2019/documenttasks" xmlns:cr="http://schemas.microsoft.com/office/comments/2020/reactions">
+          <mc:Fallback xmlns:cr="http://schemas.microsoft.com/office/comments/2020/reactions" xmlns="http://schemas.microsoft.com/office/tasks/2019/documenttasks" xmlns:dgm="http://schemas.openxmlformats.org/drawingml/2006/diagram" xmlns:lc="http://schemas.openxmlformats.org/drawingml/2006/lockedCanvas" xmlns:c="http://schemas.openxmlformats.org/drawingml/2006/chart" xmlns:pic="http://schemas.openxmlformats.org/drawingml/2006/picture" xmlns:a="http://schemas.openxmlformats.org/drawingml/2006/main" xmlns:sl="http://schemas.openxmlformats.org/schemaLibrary/2006/main">
             <w:drawing>
               <wp:anchor allowOverlap="1" behindDoc="1" distB="0" distT="0" distL="0" distR="0" hidden="0" layoutInCell="1" locked="0" relativeHeight="0" simplePos="0">
                 <wp:simplePos x="0" y="0"/>
@@ -2598,7 +2598,27 @@
           <w:sz w:val="20"/>
           <w:szCs w:val="20"/>
         </w:rPr>
-        <w:t xml:space="preserve">A continuación se describen los roles involucrados en el proyecto y sus responsabilidades directas con el </w:t>
+        <w:t xml:space="preserve">A </w:t>
+      </w:r>
+      <w:proofErr w:type="gramStart"/>
+      <w:r>
+        <w:rPr>
+          <w:rFonts w:ascii="Montserrat Medium" w:eastAsia="Montserrat Medium" w:hAnsi="Montserrat Medium" w:cs="Montserrat Medium"/>
+          <w:color w:val="595959"/>
+          <w:sz w:val="20"/>
+          <w:szCs w:val="20"/>
+        </w:rPr>
+        <w:t>continuación</w:t>
+      </w:r>
+      <w:proofErr w:type="gramEnd"/>
+      <w:r>
+        <w:rPr>
+          <w:rFonts w:ascii="Montserrat Medium" w:eastAsia="Montserrat Medium" w:hAnsi="Montserrat Medium" w:cs="Montserrat Medium"/>
+          <w:color w:val="595959"/>
+          <w:sz w:val="20"/>
+          <w:szCs w:val="20"/>
+        </w:rPr>
+        <w:t xml:space="preserve"> se describen los roles involucrados en el proyecto y sus responsabilidades directas con el </w:t>
       </w:r>
       <w:proofErr w:type="spellStart"/>
       <w:r>
@@ -3296,13 +3316,31 @@
               <w:jc w:val="both"/>
               <w:rPr>
                 <w:rFonts w:ascii="Montserrat Medium" w:eastAsia="Montserrat Medium" w:hAnsi="Montserrat Medium" w:cs="Montserrat Medium"/>
-                <w:i/>
-                <w:iCs/>
-                <w:color w:val="FF0000"/>
-                <w:sz w:val="20"/>
-                <w:szCs w:val="20"/>
-              </w:rPr>
-            </w:pPr>
+                <w:color w:val="FF0000"/>
+                <w:sz w:val="20"/>
+                <w:szCs w:val="20"/>
+              </w:rPr>
+            </w:pPr>
+            <w:r>
+              <w:rPr>
+                <w:rFonts w:ascii="Montserrat Medium" w:eastAsia="Montserrat Medium" w:hAnsi="Montserrat Medium" w:cs="Montserrat Medium"/>
+                <w:color w:val="595959"/>
+                <w:sz w:val="20"/>
+                <w:szCs w:val="20"/>
+              </w:rPr>
+              <w:t xml:space="preserve">Yohane </w:t>
+            </w:r>
+            <w:proofErr w:type="spellStart"/>
+            <w:r>
+              <w:rPr>
+                <w:rFonts w:ascii="Montserrat Medium" w:eastAsia="Montserrat Medium" w:hAnsi="Montserrat Medium" w:cs="Montserrat Medium"/>
+                <w:color w:val="595959"/>
+                <w:sz w:val="20"/>
+                <w:szCs w:val="20"/>
+              </w:rPr>
+              <w:t>Martinez</w:t>
+            </w:r>
+            <w:proofErr w:type="spellEnd"/>
           </w:p>
         </w:tc>
       </w:tr>
@@ -3339,8 +3377,19 @@
                 <w:sz w:val="20"/>
                 <w:szCs w:val="20"/>
               </w:rPr>
-              <w:t>Scrum Master</w:t>
-            </w:r>
+              <w:t xml:space="preserve">Scrum </w:t>
+            </w:r>
+            <w:proofErr w:type="gramStart"/>
+            <w:r>
+              <w:rPr>
+                <w:rFonts w:ascii="Montserrat Medium" w:eastAsia="Montserrat Medium" w:hAnsi="Montserrat Medium" w:cs="Montserrat Medium"/>
+                <w:color w:val="595959"/>
+                <w:sz w:val="20"/>
+                <w:szCs w:val="20"/>
+              </w:rPr>
+              <w:t>Master</w:t>
+            </w:r>
+            <w:proofErr w:type="gramEnd"/>
           </w:p>
         </w:tc>
         <w:tc>
@@ -4125,14 +4174,25 @@
                 <w:szCs w:val="20"/>
               </w:rPr>
             </w:pPr>
-            <w:r>
-              <w:rPr>
-                <w:rFonts w:ascii="Montserrat Medium" w:eastAsia="Montserrat Medium" w:hAnsi="Montserrat Medium" w:cs="Montserrat Medium"/>
-                <w:color w:val="595959"/>
-                <w:sz w:val="20"/>
-                <w:szCs w:val="20"/>
-              </w:rPr>
-              <w:t>Asegurar que se cumplan con los requisitos, estándares y objetivos de buenas prácticas</w:t>
+            <w:proofErr w:type="gramStart"/>
+            <w:r>
+              <w:rPr>
+                <w:rFonts w:ascii="Montserrat Medium" w:eastAsia="Montserrat Medium" w:hAnsi="Montserrat Medium" w:cs="Montserrat Medium"/>
+                <w:color w:val="595959"/>
+                <w:sz w:val="20"/>
+                <w:szCs w:val="20"/>
+              </w:rPr>
+              <w:t>Asegurar</w:t>
+            </w:r>
+            <w:proofErr w:type="gramEnd"/>
+            <w:r>
+              <w:rPr>
+                <w:rFonts w:ascii="Montserrat Medium" w:eastAsia="Montserrat Medium" w:hAnsi="Montserrat Medium" w:cs="Montserrat Medium"/>
+                <w:color w:val="595959"/>
+                <w:sz w:val="20"/>
+                <w:szCs w:val="20"/>
+              </w:rPr>
+              <w:t xml:space="preserve"> que se cumplan con los requisitos, estándares y objetivos de buenas prácticas</w:t>
             </w:r>
           </w:p>
           <w:p>
@@ -4327,7 +4387,27 @@
           <w:sz w:val="20"/>
           <w:szCs w:val="20"/>
         </w:rPr>
-        <w:t xml:space="preserve">A continuación se describen las aplicaciones que se necesitan para completar el proceso del Software, así como su entorno y detalles. </w:t>
+        <w:t xml:space="preserve">A </w:t>
+      </w:r>
+      <w:proofErr w:type="gramStart"/>
+      <w:r>
+        <w:rPr>
+          <w:rFonts w:ascii="Montserrat Medium" w:eastAsia="Montserrat Medium" w:hAnsi="Montserrat Medium" w:cs="Montserrat Medium"/>
+          <w:color w:val="545454"/>
+          <w:sz w:val="20"/>
+          <w:szCs w:val="20"/>
+        </w:rPr>
+        <w:t>continuación</w:t>
+      </w:r>
+      <w:proofErr w:type="gramEnd"/>
+      <w:r>
+        <w:rPr>
+          <w:rFonts w:ascii="Montserrat Medium" w:eastAsia="Montserrat Medium" w:hAnsi="Montserrat Medium" w:cs="Montserrat Medium"/>
+          <w:color w:val="545454"/>
+          <w:sz w:val="20"/>
+          <w:szCs w:val="20"/>
+        </w:rPr>
+        <w:t xml:space="preserve"> se describen las aplicaciones que se necesitan para completar el proceso del Software, así como su entorno y detalles. </w:t>
       </w:r>
     </w:p>
     <w:p>
@@ -4687,8 +4767,21 @@
                 <w:sz w:val="20"/>
                 <w:szCs w:val="20"/>
               </w:rPr>
-              <w:t>Nombre de la  integración</w:t>
-            </w:r>
+              <w:t xml:space="preserve">Nombre de </w:t>
+            </w:r>
+            <w:proofErr w:type="gramStart"/>
+            <w:r>
+              <w:rPr>
+                <w:rFonts w:ascii="Montserrat" w:eastAsia="Montserrat" w:hAnsi="Montserrat" w:cs="Montserrat"/>
+                <w:b/>
+                <w:bCs/>
+                <w:color w:val="FFFFFF"/>
+                <w:sz w:val="20"/>
+                <w:szCs w:val="20"/>
+              </w:rPr>
+              <w:t>la  integración</w:t>
+            </w:r>
+            <w:proofErr w:type="gramEnd"/>
           </w:p>
         </w:tc>
         <w:tc>
@@ -5781,7 +5874,27 @@
           <w:sz w:val="20"/>
           <w:szCs w:val="20"/>
         </w:rPr>
-        <w:t>A continuación se describen los diferentes tipos de pruebas que se aplicarán a este proyecto</w:t>
+        <w:t xml:space="preserve">A </w:t>
+      </w:r>
+      <w:proofErr w:type="gramStart"/>
+      <w:r>
+        <w:rPr>
+          <w:rFonts w:ascii="Montserrat Medium" w:eastAsia="Montserrat Medium" w:hAnsi="Montserrat Medium" w:cs="Montserrat Medium"/>
+          <w:color w:val="595959"/>
+          <w:sz w:val="20"/>
+          <w:szCs w:val="20"/>
+        </w:rPr>
+        <w:t>continuación</w:t>
+      </w:r>
+      <w:proofErr w:type="gramEnd"/>
+      <w:r>
+        <w:rPr>
+          <w:rFonts w:ascii="Montserrat Medium" w:eastAsia="Montserrat Medium" w:hAnsi="Montserrat Medium" w:cs="Montserrat Medium"/>
+          <w:color w:val="595959"/>
+          <w:sz w:val="20"/>
+          <w:szCs w:val="20"/>
+        </w:rPr>
+        <w:t xml:space="preserve"> se describen los diferentes tipos de pruebas que se aplicarán a este proyecto</w:t>
       </w:r>
     </w:p>
     <w:p>
@@ -6762,7 +6875,31 @@
                 <w:sz w:val="20"/>
                 <w:szCs w:val="20"/>
               </w:rPr>
-              <w:t xml:space="preserve">Probar el 40% de los test Cases Creados </w:t>
+              <w:t xml:space="preserve">Probar el 40% de </w:t>
+            </w:r>
+            <w:proofErr w:type="gramStart"/>
+            <w:r>
+              <w:rPr>
+                <w:rFonts w:ascii="Montserrat Medium" w:eastAsia="Montserrat Medium" w:hAnsi="Montserrat Medium" w:cs="Montserrat Medium"/>
+                <w:i/>
+                <w:iCs/>
+                <w:color w:val="FF0000"/>
+                <w:sz w:val="20"/>
+                <w:szCs w:val="20"/>
+              </w:rPr>
+              <w:t>los test</w:t>
+            </w:r>
+            <w:proofErr w:type="gramEnd"/>
+            <w:r>
+              <w:rPr>
+                <w:rFonts w:ascii="Montserrat Medium" w:eastAsia="Montserrat Medium" w:hAnsi="Montserrat Medium" w:cs="Montserrat Medium"/>
+                <w:i/>
+                <w:iCs/>
+                <w:color w:val="FF0000"/>
+                <w:sz w:val="20"/>
+                <w:szCs w:val="20"/>
+              </w:rPr>
+              <w:t xml:space="preserve"> Cases Creados </w:t>
             </w:r>
           </w:p>
         </w:tc>
@@ -6898,7 +7035,31 @@
                 <w:sz w:val="20"/>
                 <w:szCs w:val="20"/>
               </w:rPr>
-              <w:t>Probar el 70% de los Test Cases Creados</w:t>
+              <w:t xml:space="preserve">Probar el 70% de </w:t>
+            </w:r>
+            <w:proofErr w:type="gramStart"/>
+            <w:r>
+              <w:rPr>
+                <w:rFonts w:ascii="Montserrat Medium" w:eastAsia="Montserrat Medium" w:hAnsi="Montserrat Medium" w:cs="Montserrat Medium"/>
+                <w:i/>
+                <w:iCs/>
+                <w:color w:val="FF0000"/>
+                <w:sz w:val="20"/>
+                <w:szCs w:val="20"/>
+              </w:rPr>
+              <w:t>los Test</w:t>
+            </w:r>
+            <w:proofErr w:type="gramEnd"/>
+            <w:r>
+              <w:rPr>
+                <w:rFonts w:ascii="Montserrat Medium" w:eastAsia="Montserrat Medium" w:hAnsi="Montserrat Medium" w:cs="Montserrat Medium"/>
+                <w:i/>
+                <w:iCs/>
+                <w:color w:val="FF0000"/>
+                <w:sz w:val="20"/>
+                <w:szCs w:val="20"/>
+              </w:rPr>
+              <w:t xml:space="preserve"> Cases Creados</w:t>
             </w:r>
           </w:p>
         </w:tc>
@@ -7034,7 +7195,31 @@
                 <w:sz w:val="20"/>
                 <w:szCs w:val="20"/>
               </w:rPr>
-              <w:t>Probar un 100% de los Test Cases Creados, incluyendo pruebas de rendimiento, etc.</w:t>
+              <w:t xml:space="preserve">Probar un 100% de </w:t>
+            </w:r>
+            <w:proofErr w:type="gramStart"/>
+            <w:r>
+              <w:rPr>
+                <w:rFonts w:ascii="Montserrat Medium" w:eastAsia="Montserrat Medium" w:hAnsi="Montserrat Medium" w:cs="Montserrat Medium"/>
+                <w:i/>
+                <w:iCs/>
+                <w:color w:val="FF0000"/>
+                <w:sz w:val="20"/>
+                <w:szCs w:val="20"/>
+              </w:rPr>
+              <w:t>los Test</w:t>
+            </w:r>
+            <w:proofErr w:type="gramEnd"/>
+            <w:r>
+              <w:rPr>
+                <w:rFonts w:ascii="Montserrat Medium" w:eastAsia="Montserrat Medium" w:hAnsi="Montserrat Medium" w:cs="Montserrat Medium"/>
+                <w:i/>
+                <w:iCs/>
+                <w:color w:val="FF0000"/>
+                <w:sz w:val="20"/>
+                <w:szCs w:val="20"/>
+              </w:rPr>
+              <w:t xml:space="preserve"> Cases Creados, incluyendo pruebas de rendimiento, etc.</w:t>
             </w:r>
           </w:p>
         </w:tc>
@@ -7644,7 +7829,27 @@
                 <w:iCs/>
                 <w:color w:val="FF0000"/>
               </w:rPr>
-              <w:t xml:space="preserve"> de los test cases no funcionales que se aplicarán</w:t>
+              <w:t xml:space="preserve"> de </w:t>
+            </w:r>
+            <w:proofErr w:type="gramStart"/>
+            <w:r>
+              <w:rPr>
+                <w:rFonts w:ascii="Montserrat Medium" w:eastAsia="Montserrat Medium" w:hAnsi="Montserrat Medium" w:cs="Montserrat Medium"/>
+                <w:i/>
+                <w:iCs/>
+                <w:color w:val="FF0000"/>
+              </w:rPr>
+              <w:t>los test</w:t>
+            </w:r>
+            <w:proofErr w:type="gramEnd"/>
+            <w:r>
+              <w:rPr>
+                <w:rFonts w:ascii="Montserrat Medium" w:eastAsia="Montserrat Medium" w:hAnsi="Montserrat Medium" w:cs="Montserrat Medium"/>
+                <w:i/>
+                <w:iCs/>
+                <w:color w:val="FF0000"/>
+              </w:rPr>
+              <w:t xml:space="preserve"> cases no funcionales que se aplicarán</w:t>
             </w:r>
           </w:p>
           <w:p>
@@ -7738,7 +7943,23 @@
                 <w:rFonts w:ascii="Montserrat Medium" w:eastAsia="Montserrat Medium" w:hAnsi="Montserrat Medium" w:cs="Montserrat Medium"/>
                 <w:color w:val="595959"/>
               </w:rPr>
-              <w:t>Para este tipo de prueba se valida y verifica el cumplimiento de los parámetros establecidos de RPA, de acuerdo al siguiente alcance:</w:t>
+              <w:t xml:space="preserve">Para este tipo de prueba se valida y verifica el cumplimiento de los parámetros establecidos de RPA, </w:t>
+            </w:r>
+            <w:proofErr w:type="gramStart"/>
+            <w:r>
+              <w:rPr>
+                <w:rFonts w:ascii="Montserrat Medium" w:eastAsia="Montserrat Medium" w:hAnsi="Montserrat Medium" w:cs="Montserrat Medium"/>
+                <w:color w:val="595959"/>
+              </w:rPr>
+              <w:t>de acuerdo al</w:t>
+            </w:r>
+            <w:proofErr w:type="gramEnd"/>
+            <w:r>
+              <w:rPr>
+                <w:rFonts w:ascii="Montserrat Medium" w:eastAsia="Montserrat Medium" w:hAnsi="Montserrat Medium" w:cs="Montserrat Medium"/>
+                <w:color w:val="595959"/>
+              </w:rPr>
+              <w:t xml:space="preserve"> siguiente alcance:</w:t>
             </w:r>
           </w:p>
           <w:p>
@@ -7870,7 +8091,39 @@
                 <w:rFonts w:ascii="Montserrat Medium" w:eastAsia="Montserrat Medium" w:hAnsi="Montserrat Medium" w:cs="Montserrat Medium"/>
                 <w:color w:val="595959"/>
               </w:rPr>
-              <w:t>Para este tipo de prueba se valida el control de seguridad del ambiente del sistema y  la exploración de vulnerabilidades de acuerdo al siguiente alcance:</w:t>
+              <w:t xml:space="preserve">Para este tipo de prueba se valida el control de seguridad del ambiente del sistema </w:t>
+            </w:r>
+            <w:proofErr w:type="gramStart"/>
+            <w:r>
+              <w:rPr>
+                <w:rFonts w:ascii="Montserrat Medium" w:eastAsia="Montserrat Medium" w:hAnsi="Montserrat Medium" w:cs="Montserrat Medium"/>
+                <w:color w:val="595959"/>
+              </w:rPr>
+              <w:t>y  la</w:t>
+            </w:r>
+            <w:proofErr w:type="gramEnd"/>
+            <w:r>
+              <w:rPr>
+                <w:rFonts w:ascii="Montserrat Medium" w:eastAsia="Montserrat Medium" w:hAnsi="Montserrat Medium" w:cs="Montserrat Medium"/>
+                <w:color w:val="595959"/>
+              </w:rPr>
+              <w:t xml:space="preserve"> exploración de vulnerabilidades </w:t>
+            </w:r>
+            <w:proofErr w:type="gramStart"/>
+            <w:r>
+              <w:rPr>
+                <w:rFonts w:ascii="Montserrat Medium" w:eastAsia="Montserrat Medium" w:hAnsi="Montserrat Medium" w:cs="Montserrat Medium"/>
+                <w:color w:val="595959"/>
+              </w:rPr>
+              <w:t>de acuerdo al</w:t>
+            </w:r>
+            <w:proofErr w:type="gramEnd"/>
+            <w:r>
+              <w:rPr>
+                <w:rFonts w:ascii="Montserrat Medium" w:eastAsia="Montserrat Medium" w:hAnsi="Montserrat Medium" w:cs="Montserrat Medium"/>
+                <w:color w:val="595959"/>
+              </w:rPr>
+              <w:t xml:space="preserve"> siguiente alcance:</w:t>
             </w:r>
           </w:p>
           <w:p>
@@ -8009,7 +8262,27 @@
           <w:sz w:val="20"/>
           <w:szCs w:val="20"/>
         </w:rPr>
-        <w:t>Esta sección contiene las pruebas fuera del alcance, pueden incluir sistemas de integración o partes de otros software, el cual tengan interacción directa, pero no entren dentro del alcance de las pruebas.</w:t>
+        <w:t xml:space="preserve">Esta sección contiene las pruebas fuera del alcance, pueden incluir sistemas de integración o partes de </w:t>
+      </w:r>
+      <w:proofErr w:type="gramStart"/>
+      <w:r>
+        <w:rPr>
+          <w:rFonts w:ascii="Montserrat Medium" w:eastAsia="Montserrat Medium" w:hAnsi="Montserrat Medium" w:cs="Montserrat Medium"/>
+          <w:color w:val="595959"/>
+          <w:sz w:val="20"/>
+          <w:szCs w:val="20"/>
+        </w:rPr>
+        <w:t>otros software</w:t>
+      </w:r>
+      <w:proofErr w:type="gramEnd"/>
+      <w:r>
+        <w:rPr>
+          <w:rFonts w:ascii="Montserrat Medium" w:eastAsia="Montserrat Medium" w:hAnsi="Montserrat Medium" w:cs="Montserrat Medium"/>
+          <w:color w:val="595959"/>
+          <w:sz w:val="20"/>
+          <w:szCs w:val="20"/>
+        </w:rPr>
+        <w:t>, el cual tengan interacción directa, pero no entren dentro del alcance de las pruebas.</w:t>
       </w:r>
     </w:p>
     <w:tbl>
@@ -8121,7 +8394,27 @@
                 <w:iCs/>
                 <w:color w:val="FF0000"/>
               </w:rPr>
-              <w:t>Listar las funcionalidades, sistemas o requerimientos que no se aplicarán pruebas así como el motivo del porqué no se probará</w:t>
+              <w:t xml:space="preserve">Listar las funcionalidades, sistemas o requerimientos que no se aplicarán </w:t>
+            </w:r>
+            <w:proofErr w:type="gramStart"/>
+            <w:r>
+              <w:rPr>
+                <w:rFonts w:ascii="Montserrat Medium" w:eastAsia="Montserrat Medium" w:hAnsi="Montserrat Medium" w:cs="Montserrat Medium"/>
+                <w:i/>
+                <w:iCs/>
+                <w:color w:val="FF0000"/>
+              </w:rPr>
+              <w:t>pruebas</w:t>
+            </w:r>
+            <w:proofErr w:type="gramEnd"/>
+            <w:r>
+              <w:rPr>
+                <w:rFonts w:ascii="Montserrat Medium" w:eastAsia="Montserrat Medium" w:hAnsi="Montserrat Medium" w:cs="Montserrat Medium"/>
+                <w:i/>
+                <w:iCs/>
+                <w:color w:val="FF0000"/>
+              </w:rPr>
+              <w:t xml:space="preserve"> así como el motivo del porqué no se probará</w:t>
             </w:r>
           </w:p>
           <w:p>
@@ -9642,6 +9935,7 @@
                 <w:szCs w:val="20"/>
               </w:rPr>
             </w:pPr>
+            <w:proofErr w:type="gramStart"/>
             <w:r>
               <w:rPr>
                 <w:rFonts w:ascii="Montserrat" w:eastAsia="Montserrat" w:hAnsi="Montserrat" w:cs="Montserrat"/>
@@ -9651,7 +9945,19 @@
                 <w:sz w:val="20"/>
                 <w:szCs w:val="20"/>
               </w:rPr>
-              <w:t>Link Google Drive</w:t>
+              <w:t>Link</w:t>
+            </w:r>
+            <w:proofErr w:type="gramEnd"/>
+            <w:r>
+              <w:rPr>
+                <w:rFonts w:ascii="Montserrat" w:eastAsia="Montserrat" w:hAnsi="Montserrat" w:cs="Montserrat"/>
+                <w:b/>
+                <w:bCs/>
+                <w:color w:val="FFFFFF"/>
+                <w:sz w:val="20"/>
+                <w:szCs w:val="20"/>
+              </w:rPr>
+              <w:t xml:space="preserve"> Google Drive</w:t>
             </w:r>
           </w:p>
         </w:tc>
@@ -10171,7 +10477,31 @@
           <w:sz w:val="20"/>
           <w:szCs w:val="20"/>
         </w:rPr>
-        <w:t>Este apartado se llena conforme va avanzando el proyecto, si alguna no requirió cambios, aun así se llenan los apartados. Si no aplico alguna se remueve de la tabla.</w:t>
+        <w:t xml:space="preserve">Este apartado se llena conforme va avanzando el proyecto, si alguna no requirió cambios, aun </w:t>
+      </w:r>
+      <w:proofErr w:type="gramStart"/>
+      <w:r>
+        <w:rPr>
+          <w:rFonts w:ascii="Montserrat Medium" w:eastAsia="Montserrat Medium" w:hAnsi="Montserrat Medium" w:cs="Montserrat Medium"/>
+          <w:i/>
+          <w:iCs/>
+          <w:color w:val="FF0000"/>
+          <w:sz w:val="20"/>
+          <w:szCs w:val="20"/>
+        </w:rPr>
+        <w:t>así</w:t>
+      </w:r>
+      <w:proofErr w:type="gramEnd"/>
+      <w:r>
+        <w:rPr>
+          <w:rFonts w:ascii="Montserrat Medium" w:eastAsia="Montserrat Medium" w:hAnsi="Montserrat Medium" w:cs="Montserrat Medium"/>
+          <w:i/>
+          <w:iCs/>
+          <w:color w:val="FF0000"/>
+          <w:sz w:val="20"/>
+          <w:szCs w:val="20"/>
+        </w:rPr>
+        <w:t xml:space="preserve"> se llenan los apartados. Si no aplico alguna se remueve de la tabla.</w:t>
       </w:r>
     </w:p>
     <w:p>
@@ -12010,7 +12340,31 @@
                 <w:sz w:val="20"/>
                 <w:szCs w:val="20"/>
               </w:rPr>
-              <w:t xml:space="preserve">Versión 2 del Plan estratégico de pruebas con cambios en los punto </w:t>
+              <w:t xml:space="preserve">Versión 2 del Plan estratégico de pruebas con cambios en </w:t>
+            </w:r>
+            <w:proofErr w:type="gramStart"/>
+            <w:r>
+              <w:rPr>
+                <w:rFonts w:ascii="Montserrat Medium" w:eastAsia="Montserrat Medium" w:hAnsi="Montserrat Medium" w:cs="Montserrat Medium"/>
+                <w:i/>
+                <w:iCs/>
+                <w:color w:val="FF0000"/>
+                <w:sz w:val="20"/>
+                <w:szCs w:val="20"/>
+              </w:rPr>
+              <w:t>los punto</w:t>
+            </w:r>
+            <w:proofErr w:type="gramEnd"/>
+            <w:r>
+              <w:rPr>
+                <w:rFonts w:ascii="Montserrat Medium" w:eastAsia="Montserrat Medium" w:hAnsi="Montserrat Medium" w:cs="Montserrat Medium"/>
+                <w:i/>
+                <w:iCs/>
+                <w:color w:val="FF0000"/>
+                <w:sz w:val="20"/>
+                <w:szCs w:val="20"/>
+              </w:rPr>
+              <w:t xml:space="preserve"> </w:t>
             </w:r>
           </w:p>
         </w:tc>

</xml_diff>